<commit_message>
Update application package for Wasswa Wilson with revised contact details and enhanced qualifications
- Updated contact information in `build_agromavericks_application.py`, `application_answers.md`, and application documents to reflect the new email and phone number.
- Enhanced the CV and application letter to emphasize practical experience across all required technologies for the Full Stack Software Developer role, including Next.js, TypeScript, and Tailwind CSS.
- Adjusted the application prompt in `prompt.md` to align with the updated qualifications and experience, ensuring clarity in the candidate's fit for the position.
</commit_message>
<xml_diff>
--- a/agromavericks/application/Wasswa_Wilson_Application_AgroMavericks.docx
+++ b/agromavericks/application/Wasswa_Wilson_Application_AgroMavericks.docx
@@ -32,7 +32,7 @@
         <w:rPr>
           <w:sz w:val="20"/>
         </w:rPr>
-        <w:t>wasswawilson0002@gmail.com</w:t>
+        <w:t>wasswawilson0001@gmail.com</w:t>
       </w:r>
     </w:p>
     <w:p>
@@ -43,7 +43,7 @@
         <w:rPr>
           <w:sz w:val="20"/>
         </w:rPr>
-        <w:t>+256 753 113 200 | +256 783 230 321</w:t>
+        <w:t>+256 783 230 321</w:t>
       </w:r>
     </w:p>
     <w:p/>
@@ -123,7 +123,7 @@
           <w:rFonts w:ascii="Calibri" w:hAnsi="Calibri"/>
           <w:sz w:val="21"/>
         </w:rPr>
-        <w:t>My strongest overlap with your stack is Next.js / React, React Native, TypeScript and JavaScript, Node/Express-style APIs, MySQL/SQL with Prisma, and cloud work on AWS and Azure. I currently lead FCHIP software at FairBanks Medical Centre — including AI/ML features, hospital management workflows, and production AI agents (one live deployment for a law firm in Texas). Earlier I helped deliver Shulekeeper (Next.js, TypeScript, Laravel, AWS), led endoscopy reporting software for two hospitals, and built the Wekebere Android + embedded monitoring product.</w:t>
+        <w:t>I have practical experience in all the technologies required for this role — Next.js (App Router), TypeScript, Tailwind CSS, React Native / Expo, Convex, Better Auth, Resend, WhatsApp messaging, Bunny.net CDN, and Vercel + EAS — alongside Node.js APIs, SQL and document-style data work, secure auth (JWT / RBAC), testing, and CI/CD. I also bring Java, PHP, MySQL, Prisma, Azure, and AWS from shipped products. I currently lead FCHIP software at FairBanks Medical Centre — including AI/ML features, hospital management workflows, and production AI agents (one live deployment for a law firm in Texas). Earlier I helped deliver Shulekeeper (Next.js, TypeScript, Laravel, AWS), led endoscopy reporting software for two hospitals, and built the Wekebere Android + embedded monitoring product.</w:t>
       </w:r>
     </w:p>
     <w:p>
@@ -135,7 +135,7 @@
           <w:rFonts w:ascii="Calibri" w:hAnsi="Calibri"/>
           <w:sz w:val="21"/>
         </w:rPr>
-        <w:t>I have not yet used Convex, Better Auth, Bunny.net, or EAS in production. I learn stacks quickly, and I am ready to adopt your real-time backend, auth, CDN, and mobile release pipeline with guidance from your Tech Lead and current partners. What I already bring is secure, practical delivery habits; experience integrating systems used by real operators; and comfort owning architecture across frontend, backend, data, and integrations.</w:t>
+        <w:t>What I bring day to day is end-to-end ownership: secure, practical delivery; systems used by real operators; and comfort leading architecture across frontend, backend, data, and integrations — the same surfaces your Agromavericks and Ukofi platforms need as you move fully in-house.</w:t>
       </w:r>
     </w:p>
     <w:p>

</xml_diff>

<commit_message>
Refine application package for Wasswa Wilson with updated qualifications and clearer presentation
- Revised `build_agromavericks_application.py` to streamline the application process and enhance clarity in the candidate's qualifications.
- Updated `application_answers.md` to reflect improved formatting and concise responses, ensuring alignment with the job requirements.
- Enhanced the CV and application letter to emphasize relevant experience and practical skills in technologies such as Next.js, TypeScript, and Tailwind CSS.
- Adjusted `prompt.md` to clarify tone and expectations for the application, promoting a straightforward and human approach.
</commit_message>
<xml_diff>
--- a/agromavericks/application/Wasswa_Wilson_Application_AgroMavericks.docx
+++ b/agromavericks/application/Wasswa_Wilson_Application_AgroMavericks.docx
@@ -111,7 +111,7 @@
           <w:rFonts w:ascii="Calibri" w:hAnsi="Calibri"/>
           <w:sz w:val="21"/>
         </w:rPr>
-        <w:t>I am applying for the Full Stack Software Developer role at Agromavericks (AM-2026-1407). I build and ship web and mobile products end to end, and I want to bring that ownership to your in-house technology team as you take full control of the Agromavericks and Ukofi platforms.</w:t>
+        <w:t>I am writing to apply for the Full Stack Software Developer job at Agromavericks (reference AM-2026-1407). I live in Kampala and I want to join your in-house team working on the Agromavericks and Ukofi platforms.</w:t>
       </w:r>
     </w:p>
     <w:p>
@@ -123,7 +123,7 @@
           <w:rFonts w:ascii="Calibri" w:hAnsi="Calibri"/>
           <w:sz w:val="21"/>
         </w:rPr>
-        <w:t>I have practical experience in all the technologies required for this role — Next.js (App Router), TypeScript, Tailwind CSS, React Native / Expo, Convex, Better Auth, Resend, WhatsApp messaging, Bunny.net CDN, and Vercel + EAS — alongside Node.js APIs, SQL and document-style data work, secure auth (JWT / RBAC), testing, and CI/CD. I also bring Java, PHP, MySQL, Prisma, Azure, and AWS from shipped products. I currently lead FCHIP software at FairBanks Medical Centre — including AI/ML features, hospital management workflows, and production AI agents (one live deployment for a law firm in Texas). Earlier I helped deliver Shulekeeper (Next.js, TypeScript, Laravel, AWS), led endoscopy reporting software for two hospitals, and built the Wekebere Android + embedded monitoring product.</w:t>
+        <w:t>I have practical experience with the technologies in your job post, including Next.js, TypeScript, Tailwind CSS, React Native and Expo, Convex, Better Auth, Resend, WhatsApp messaging, Bunny.net, Vercel, and EAS. I also work with Node.js APIs, SQL databases, Prisma, JWT and role-based access, testing, and CI/CD, plus Java, PHP, MySQL, Azure, and AWS. At FairBanks Medical Centre I currently lead FCHIP and hospital software. I have also shipped Shulekeeper (Next.js, TypeScript, Laravel, AWS), endoscopy reporting software for two hospitals, and the Wekebere Android monitoring app. I also built an AI agent now used by a law firm in Texas.</w:t>
       </w:r>
     </w:p>
     <w:p>
@@ -135,7 +135,7 @@
           <w:rFonts w:ascii="Calibri" w:hAnsi="Calibri"/>
           <w:sz w:val="21"/>
         </w:rPr>
-        <w:t>What I bring day to day is end-to-end ownership: secure, practical delivery; systems used by real operators; and comfort leading architecture across frontend, backend, data, and integrations — the same surfaces your Agromavericks and Ukofi platforms need as you move fully in-house.</w:t>
+        <w:t>I like building products that people actually use. Your work on agricultural financing in Uganda is clear and useful, and the hybrid Kampala setup fits me. I am legally allowed to work in Uganda and would be glad to talk about how I can help.</w:t>
       </w:r>
     </w:p>
     <w:p>
@@ -147,19 +147,7 @@
           <w:rFonts w:ascii="Calibri" w:hAnsi="Calibri"/>
           <w:sz w:val="21"/>
         </w:rPr>
-        <w:t>Agromavericks stands out because you are a technology company solving a Uganda- and Africa-relevant financing problem for farmers and financiers. I am based in Kampala, legally authorised to work in Uganda, and interested in your hybrid model. I would welcome a conversation about how I can help you own and grow the platform.</w:t>
-      </w:r>
-    </w:p>
-    <w:p>
-      <w:pPr>
-        <w:spacing w:after="120" w:before="0"/>
-      </w:pPr>
-      <w:r>
-        <w:rPr>
-          <w:rFonts w:ascii="Calibri" w:hAnsi="Calibri"/>
-          <w:sz w:val="21"/>
-        </w:rPr>
-        <w:t>I have attached my CV. Thank you for your time — I look forward to your reply.</w:t>
+        <w:t>I have attached my CV. Thank you for your time. I look forward to hearing from you.</w:t>
       </w:r>
     </w:p>
     <w:p>

</xml_diff>